<commit_message>
Add interview themes that were not in the questionnaire.
The summary report now has a section on EDO topics companies raised outside the 33 template questions.

Co-authored-by: lysakalenushka-hash <lysakalenushka-hash@users.noreply.github.com>
</commit_message>
<xml_diff>
--- a/транскрипции/Ответы по вопросам/Сводный отчёт по интервью ЭДО.docx
+++ b/транскрипции/Ответы по вопросам/Сводный отчёт по интервью ЭДО.docx
@@ -85,7 +85,7 @@
           <w:i w:val="0"/>
           <w:sz w:val="24"/>
         </w:rPr>
-        <w:t>Ниже выводы идут в порядке анкеты и собраны по блокам сводной таблицы. По каждому вопросу сначала коротко, о чём он, затем общий вывод по тем компаниям, которые ответили. Если практика расходится, компании названы. Если ответили один или двое, это сказано прямо. Если «без ответа» стоит у большинства, вопрос отмечен как почти не покрытый.</w:t>
+        <w:t>Ниже выводы идут в порядке анкеты и собраны по блокам сводной таблицы. По каждому вопросу сначала коротко, о чём он, затем общий вывод по тем компаниям, которые ответили. Если практика расходится, компании названы. Если ответили один или двое, это сказано прямо. Если «без ответа» стоит у большинства, вопрос отмечен как почти не покрытый. После общих выводов отдельно собраны темы, которые в разговорах звучали, но отдельным вопросом анкеты не стояли.</w:t>
       </w:r>
     </w:p>
     <w:p>
@@ -3502,6 +3502,216 @@
         <w:t>9. Часть анкеты почти не прозвучала. Вопрос, изменилось ли что-нибудь после перевода какого-то документа, и просьба дать один совет начинающей организации — без ответа у всех семи. Самый успешный перевод назвали только «Металлоинвест» и «МЭЛОН ФЭШН ГРУП», и ни один не выбрал один документ. Термином «простая электронная подпись» компании свой вход не называют. Про ЕСИА прямо не говорил никто. Три требования к будущей системе списком не продиктовал никто.</w:t>
       </w:r>
     </w:p>
+    <w:p>
+      <w:pPr>
+        <w:spacing w:before="280" w:after="120" w:line="276" w:lineRule="auto"/>
+      </w:pPr>
+      <w:r>
+        <w:rPr>
+          <w:rFonts w:ascii="Times New Roman" w:hAnsi="Times New Roman" w:cs="Times New Roman" w:eastAsia="Times New Roman"/>
+          <w:b/>
+          <w:i w:val="0"/>
+          <w:sz w:val="28"/>
+        </w:rPr>
+        <w:t>5. Темы, которые обсуждались вне анкеты</w:t>
+      </w:r>
+    </w:p>
+    <w:p>
+      <w:pPr>
+        <w:spacing w:before="0" w:after="120" w:line="276" w:lineRule="auto"/>
+      </w:pPr>
+      <w:r>
+        <w:rPr>
+          <w:rFonts w:ascii="Times New Roman" w:hAnsi="Times New Roman" w:cs="Times New Roman" w:eastAsia="Times New Roman"/>
+          <w:b w:val="0"/>
+          <w:i w:val="0"/>
+          <w:sz w:val="24"/>
+        </w:rPr>
+        <w:t>Ниже только то, что компании говорили сами и что не вынесено в отдельный вопрос анкеты. Разбор Минтруда, судебные примеры исследователей и модель затрат на 17 тысяч человек сюда не входят.</w:t>
+      </w:r>
+    </w:p>
+    <w:p>
+      <w:pPr>
+        <w:spacing w:before="0" w:after="120" w:line="276" w:lineRule="auto"/>
+      </w:pPr>
+      <w:r>
+        <w:rPr>
+          <w:rFonts w:ascii="Times New Roman" w:hAnsi="Times New Roman" w:cs="Times New Roman" w:eastAsia="Times New Roman"/>
+          <w:b w:val="0"/>
+          <w:i w:val="0"/>
+          <w:sz w:val="24"/>
+        </w:rPr>
+        <w:t>Личные карточки по охране труда. «КУПИШУЗ» прямо говорит, что карточки в документооборот ещё не переведены целиком: этим занята проектная команда, электронное подписание только стартует, цель — 100%. В анкете такого документа нет.</w:t>
+      </w:r>
+    </w:p>
+    <w:p>
+      <w:pPr>
+        <w:spacing w:before="0" w:after="120" w:line="276" w:lineRule="auto"/>
+      </w:pPr>
+      <w:r>
+        <w:rPr>
+          <w:rFonts w:ascii="Times New Roman" w:hAnsi="Times New Roman" w:cs="Times New Roman" w:eastAsia="Times New Roman"/>
+          <w:b w:val="0"/>
+          <w:i w:val="0"/>
+          <w:sz w:val="24"/>
+        </w:rPr>
+        <w:t>Дата протокола и дата подписи комиссии. «КУПИШУЗ» описывает протокол одной датой и подписи членов комиссии позже. Иначе со дня, указанного в протоколе, допуск уже спорный. Обсуждали, что подписи надо собрать заранее, примерно за неделю до конца срока обучения. «Ареал» ту же развилку называет, но как её закрывают регламентом, не договорил.</w:t>
+      </w:r>
+    </w:p>
+    <w:p>
+      <w:pPr>
+        <w:spacing w:before="0" w:after="120" w:line="276" w:lineRule="auto"/>
+      </w:pPr>
+      <w:r>
+        <w:rPr>
+          <w:rFonts w:ascii="Times New Roman" w:hAnsi="Times New Roman" w:cs="Times New Roman" w:eastAsia="Times New Roman"/>
+          <w:b w:val="0"/>
+          <w:i w:val="0"/>
+          <w:sz w:val="24"/>
+        </w:rPr>
+        <w:t>Копии протокола по дивизиону. У «КУПИШУЗ» в южном дивизионе одна комиссия на 50 городов. Оригинал протокола копируют и пересылают, пока комиссия не соберётся. Компания сама говорит, что так нарушает правило одного документа, и считает риск низким, пока бумагу не запросили. Реплика о штрафе из-за члена комиссии в записи обрывается, за что именно штраф, не разобрать.</w:t>
+      </w:r>
+    </w:p>
+    <w:p>
+      <w:pPr>
+        <w:spacing w:before="0" w:after="120" w:line="276" w:lineRule="auto"/>
+      </w:pPr>
+      <w:r>
+        <w:rPr>
+          <w:rFonts w:ascii="Times New Roman" w:hAnsi="Times New Roman" w:cs="Times New Roman" w:eastAsia="Times New Roman"/>
+          <w:b w:val="0"/>
+          <w:i w:val="0"/>
+          <w:sz w:val="24"/>
+        </w:rPr>
+        <w:t>Файл подписи эксперта по спецоценке. «КУПИШУЗ» и «Ареал» упираются в то, что к карте нельзя приложить файл подписи эксперта: опции нет. У «КУПИШУЗ» отдельно звучит риск подписать работнику одну карту, тогда как эксперт подписывал весь отчёт. «МЭЛОН ФЭШН ГРУП» называет действующую схему нарушением: скан с живыми подписями плюс электронная подпись работника. Ждут от внешней организации архив с файлами подписи, а не бумажную карту. «Металлоинвест» спецоценку тоже не снял с живой подписи: смена организации, которая её проводит, остановила договорённость подписывать усиленной неквалифицированной подписью.</w:t>
+      </w:r>
+    </w:p>
+    <w:p>
+      <w:pPr>
+        <w:spacing w:before="0" w:after="120" w:line="276" w:lineRule="auto"/>
+      </w:pPr>
+      <w:r>
+        <w:rPr>
+          <w:rFonts w:ascii="Times New Roman" w:hAnsi="Times New Roman" w:cs="Times New Roman" w:eastAsia="Times New Roman"/>
+          <w:b w:val="0"/>
+          <w:i w:val="0"/>
+          <w:sz w:val="24"/>
+        </w:rPr>
+        <w:t>Наряд-допуск и целевой инструктаж. «Металлоинвест» регистрирует наряд под учётной записью и ролью, а целевой инструктаж на работы повышенной опасности печатает и хранит живые подписи 30 дней. Усиленная неквалифицированная подпись на этом шаге подготовлена и сознательно не включена, пока нет решения, что так можно. «ТГК-1» смотрел электронный наряд и бумагу не убрал. «Балтика» планирует электронный наряд в этом году и уже делит процесс на наряд и допуск. «КУПИШУЗ» отделяет целевой инструктаж, который подписывает охрана труда, от первичного и повторного, который заводит руководитель, и сомневается, что на наряде люди станут ещё и писать причины.</w:t>
+      </w:r>
+    </w:p>
+    <w:p>
+      <w:pPr>
+        <w:spacing w:before="0" w:after="120" w:line="276" w:lineRule="auto"/>
+      </w:pPr>
+      <w:r>
+        <w:rPr>
+          <w:rFonts w:ascii="Times New Roman" w:hAnsi="Times New Roman" w:cs="Times New Roman" w:eastAsia="Times New Roman"/>
+          <w:b w:val="0"/>
+          <w:i w:val="0"/>
+          <w:sz w:val="24"/>
+        </w:rPr>
+        <w:t>Пожарный инструктаж и журналы, которые удалось увести с бумаги. «Металлоинвест» пожарный инструктаж подписывает усиленной неквалифицированной подписью и говорит, что ограничение обучения по охране труда на него не распространяется. Журнал трёхступенчатого контроля и регистрацию наряда оставил на учётной записи, без отдельной подписи. Это не общий список документов из анкеты, а конкретные процедуры, которые компания уже считает электронными.</w:t>
+      </w:r>
+    </w:p>
+    <w:p>
+      <w:pPr>
+        <w:spacing w:before="0" w:after="120" w:line="276" w:lineRule="auto"/>
+      </w:pPr>
+      <w:r>
+        <w:rPr>
+          <w:rFonts w:ascii="Times New Roman" w:hAnsi="Times New Roman" w:cs="Times New Roman" w:eastAsia="Times New Roman"/>
+          <w:b w:val="0"/>
+          <w:i w:val="0"/>
+          <w:sz w:val="24"/>
+        </w:rPr>
+        <w:t>Медосмотры и пропуск подрядчиков. «Газпром нефть» держит медосмотры отдельным ручным контуром, не внутри охраны труда. По подрядчикам есть медицинская система без подписей и пропуск на месторождение: карта, доступ есть или нет. Эту пропускную систему разрабатывали не сами. В анкете медосмотров и допуска подрядчиков нет.</w:t>
+      </w:r>
+    </w:p>
+    <w:p>
+      <w:pPr>
+        <w:spacing w:before="0" w:after="120" w:line="276" w:lineRule="auto"/>
+      </w:pPr>
+      <w:r>
+        <w:rPr>
+          <w:rFonts w:ascii="Times New Roman" w:hAnsi="Times New Roman" w:cs="Times New Roman" w:eastAsia="Times New Roman"/>
+          <w:b w:val="0"/>
+          <w:i w:val="0"/>
+          <w:sz w:val="24"/>
+        </w:rPr>
+        <w:t>Кадры уже в электронном виде, охрана труда отстаёт. У «Балтики» кадровые документы давно на простой подписи, усиленная неквалифицированная — примерно последние два года, обучение с 2023 года ведёт провайдер. У «Газпром нефти» договоры, доверенности и кадровые задания живут отдельно от документов охраны труда, эффект отпусков и командировок собеседник относит не к себе. У «ТГК-1» кадрового электронного документооборота нет и в ближайшие годы не ждут: группа меняет версию платформы. У «Ареала» через тот же КЭДО, что и ознакомление, идут отпуска, командировки и заявки.</w:t>
+      </w:r>
+    </w:p>
+    <w:p>
+      <w:pPr>
+        <w:spacing w:before="0" w:after="120" w:line="276" w:lineRule="auto"/>
+      </w:pPr>
+      <w:r>
+        <w:rPr>
+          <w:rFonts w:ascii="Times New Roman" w:hAnsi="Times New Roman" w:cs="Times New Roman" w:eastAsia="Times New Roman"/>
+          <w:b w:val="0"/>
+          <w:i w:val="0"/>
+          <w:sz w:val="24"/>
+        </w:rPr>
+        <w:t>Информационная безопасность, свой удостоверяющий центр и носитель подписи. «Ареал» не отдаёт инструкции во внешние ресурсы: часть сведений может быть коммерческой. «Газпром нефть» оставляет свой удостоверяющий центр и токен, госключ называет неподходящим, личный телефон на площадке нельзя. «ТГК-1» согласовало с информационной безопасностью пароль на сменном смартфоне: физический носитель и пропуск отклонили, пароль можно передать, и это принятый компромисс. Личный телефон на объекте не используют.</w:t>
+      </w:r>
+    </w:p>
+    <w:p>
+      <w:pPr>
+        <w:spacing w:before="0" w:after="120" w:line="276" w:lineRule="auto"/>
+      </w:pPr>
+      <w:r>
+        <w:rPr>
+          <w:rFonts w:ascii="Times New Roman" w:hAnsi="Times New Roman" w:cs="Times New Roman" w:eastAsia="Times New Roman"/>
+          <w:b w:val="0"/>
+          <w:i w:val="0"/>
+          <w:sz w:val="24"/>
+        </w:rPr>
+        <w:t>Согласие работника на электронный оборот. «Ареал» связывает старт электронной подписи с согласием работника, в том числе при трудоустройстве. «Балтика» говорит, что вводный инструктаж не реализует, если вместе с разрешением придёт отдельное согласие на электронный оборот. Отдельного вопроса про согласие в анкете нет.</w:t>
+      </w:r>
+    </w:p>
+    <w:p>
+      <w:pPr>
+        <w:spacing w:before="0" w:after="120" w:line="276" w:lineRule="auto"/>
+      </w:pPr>
+      <w:r>
+        <w:rPr>
+          <w:rFonts w:ascii="Times New Roman" w:hAnsi="Times New Roman" w:cs="Times New Roman" w:eastAsia="Times New Roman"/>
+          <w:b w:val="0"/>
+          <w:i w:val="0"/>
+          <w:sz w:val="24"/>
+        </w:rPr>
+        <w:t>Бумажный журнал как доказательство, которое не сохранилось. «ТГК-1» рассказывает, что при расследовании не нашли журнал инструктажа на рабочем месте: его уничтожили по сроку хранения. Это не ответ на вопрос анкеты про эффект, а отдельный довод, почему одной бумаги компании мало.</w:t>
+      </w:r>
+    </w:p>
+    <w:p>
+      <w:pPr>
+        <w:spacing w:before="0" w:after="120" w:line="276" w:lineRule="auto"/>
+      </w:pPr>
+      <w:r>
+        <w:rPr>
+          <w:rFonts w:ascii="Times New Roman" w:hAnsi="Times New Roman" w:cs="Times New Roman" w:eastAsia="Times New Roman"/>
+          <w:b w:val="0"/>
+          <w:i w:val="0"/>
+          <w:sz w:val="24"/>
+        </w:rPr>
+        <w:t>Сопротивление людей. «Металлоинвест» называет подпись барьером, который пока не победили, и описывает разъяснительную кампанию: собрания, ролики, газета, видеообращения руководителей. «Балтика» оценивает оставшееся сопротивление примерно в один процент: раньше его было больше. Долю отказавшихся остальные не называют.</w:t>
+      </w:r>
+    </w:p>
+    <w:p>
+      <w:pPr>
+        <w:spacing w:before="0" w:after="120" w:line="276" w:lineRule="auto"/>
+      </w:pPr>
+      <w:r>
+        <w:rPr>
+          <w:rFonts w:ascii="Times New Roman" w:hAnsi="Times New Roman" w:cs="Times New Roman" w:eastAsia="Times New Roman"/>
+          <w:b w:val="0"/>
+          <w:i w:val="0"/>
+          <w:sz w:val="24"/>
+        </w:rPr>
+        <w:t>Вводный инструктаж для тех, кто не в контуре компании. «МЭЛОН ФЭШН ГРУП» вводный для сторонних организаций проводит только лично, не через электронный документооборот. Своим работникам вводный в системе не всегда проходит в тот же день. В анкете сторонние лица отдельно не спрашиваются.</w:t>
+      </w:r>
+    </w:p>
     <w:sectPr>
       <w:pgSz w:w="11906" w:h="16838"/>
       <w:pgMar w:top="1134" w:right="1134" w:bottom="1134" w:left="1417" w:header="720" w:footer="720" w:gutter="0"/>

</xml_diff>

<commit_message>
Ground the extra interview themes in the company transcripts.
Keep the per-question summary and correct the section on topics that were not in the 33-question list: name the companies that actually discussed each point and drop claims the recordings do not support.

Co-authored-by: lysakalenushka-hash <lysakalenushka-hash@users.noreply.github.com>
</commit_message>
<xml_diff>
--- a/транскрипции/Ответы по вопросам/Сводный отчёт по интервью ЭДО.docx
+++ b/транскрипции/Ответы по вопросам/Сводный отчёт по интервью ЭДО.docx
@@ -76,16 +76,15 @@
     </w:p>
     <w:p>
       <w:pPr>
-        <w:spacing w:before="0" w:after="160" w:line="276" w:lineRule="auto"/>
+        <w:spacing w:before="0" w:after="120" w:line="276" w:lineRule="auto"/>
       </w:pPr>
       <w:r>
         <w:rPr>
           <w:rFonts w:ascii="Times New Roman" w:hAnsi="Times New Roman" w:cs="Times New Roman" w:eastAsia="Times New Roman"/>
           <w:b w:val="0"/>
-          <w:i w:val="0"/>
           <w:sz w:val="24"/>
         </w:rPr>
-        <w:t>Ниже выводы идут в порядке анкеты и собраны по блокам сводной таблицы. По каждому вопросу сначала коротко, о чём он, затем общий вывод по тем компаниям, которые ответили. Если практика расходится, компании названы. Если ответили один или двое, это сказано прямо. Если «без ответа» стоит у большинства, вопрос отмечен как почти не покрытый. После общих выводов отдельно собраны темы, которые в разговорах звучали, но отдельным вопросом анкеты не стояли.</w:t>
+        <w:t>Ниже выводы идут в порядке анкеты и собраны по блокам сводной таблицы. По каждому вопросу сначала коротко, о чём он, затем общий вывод по тем компаниям, которые ответили. Если практика расходится, компании названы. Если ответили один или двое, это сказано прямо. Если «без ответа» стоит у большинства, вопрос отмечен как почти не покрытый. После общих выводов есть раздел «Темы, которые обсуждались вне анкеты»: туда собраны сюжеты, которые в разговорах звучали, но отдельным вопросом анкеты не стояли.</w:t>
       </w:r>
     </w:p>
     <w:p>
@@ -3538,10 +3537,9 @@
         <w:rPr>
           <w:rFonts w:ascii="Times New Roman" w:hAnsi="Times New Roman" w:cs="Times New Roman" w:eastAsia="Times New Roman"/>
           <w:b w:val="0"/>
-          <w:i w:val="0"/>
           <w:sz w:val="24"/>
         </w:rPr>
-        <w:t>Личные карточки по охране труда. «КУПИШУЗ» прямо говорит, что карточки в документооборот ещё не переведены целиком: этим занята проектная команда, электронное подписание только стартует, цель — 100%. В анкете такого документа нет.</w:t>
+        <w:t>Личные карточки по охране труда. «КУПИШУЗ» прямо говорит, что карточки в документооборот ещё не переведены целиком: этим занята проектная команда, в записи звучит блок в 1С, название модуля не разобрать. Электронное подписание в целом только стартует, цель — 100%. В анкете личного карточного учёта по охране труда нет.</w:t>
       </w:r>
     </w:p>
     <w:p>
@@ -3552,10 +3550,9 @@
         <w:rPr>
           <w:rFonts w:ascii="Times New Roman" w:hAnsi="Times New Roman" w:cs="Times New Roman" w:eastAsia="Times New Roman"/>
           <w:b w:val="0"/>
-          <w:i w:val="0"/>
           <w:sz w:val="24"/>
         </w:rPr>
-        <w:t>Дата протокола и дата подписи комиссии. «КУПИШУЗ» описывает протокол одной датой и подписи членов комиссии позже. Иначе со дня, указанного в протоколе, допуск уже спорный. Обсуждали, что подписи надо собрать заранее, примерно за неделю до конца срока обучения. «Ареал» ту же развилку называет, но как её закрывают регламентом, не договорил.</w:t>
+        <w:t>Дата протокола и дата подписи комиссии. Это узел «КУПИШУЗ». Протокол может быть датирован днём проверки знаний, а члены комиссии подписывают позже. В разговоре пример такой: протокол от первого сентября, подписи третьего. Иначе со дня, указанного в протоколе, допуск уже спорный. Обсуждали, что подписи надо собрать заранее, примерно за неделю до конца срока обучения. Реплика о штрафе из-за члена комиссии обрывается: кто говорил и за что, не разобрать.</w:t>
       </w:r>
     </w:p>
     <w:p>
@@ -3566,10 +3563,9 @@
         <w:rPr>
           <w:rFonts w:ascii="Times New Roman" w:hAnsi="Times New Roman" w:cs="Times New Roman" w:eastAsia="Times New Roman"/>
           <w:b w:val="0"/>
-          <w:i w:val="0"/>
           <w:sz w:val="24"/>
         </w:rPr>
-        <w:t>Копии протокола по дивизиону. У «КУПИШУЗ» в южном дивизионе одна комиссия на 50 городов. Оригинал протокола копируют и пересылают, пока комиссия не соберётся. Компания сама говорит, что так нарушает правило одного документа, и считает риск низким, пока бумагу не запросили. Реплика о штрафе из-за члена комиссии в записи обрывается, за что именно штраф, не разобрать.</w:t>
+        <w:t>Копии протокола по дивизиону. У «КУПИШУЗ» в южном дивизионе одна комиссия на 50 городов. Оригинал протокола копируют и пересылают, пока комиссия не соберётся. Компания сама говорит, что так нарушает правило одного документа, и считает риск низким, пока документ не запросили.</w:t>
       </w:r>
     </w:p>
     <w:p>
@@ -3580,10 +3576,9 @@
         <w:rPr>
           <w:rFonts w:ascii="Times New Roman" w:hAnsi="Times New Roman" w:cs="Times New Roman" w:eastAsia="Times New Roman"/>
           <w:b w:val="0"/>
-          <w:i w:val="0"/>
           <w:sz w:val="24"/>
         </w:rPr>
-        <w:t>Файл подписи эксперта по спецоценке. «КУПИШУЗ» и «Ареал» упираются в то, что к карте нельзя приложить файл подписи эксперта: опции нет. У «КУПИШУЗ» отдельно звучит риск подписать работнику одну карту, тогда как эксперт подписывал весь отчёт. «МЭЛОН ФЭШН ГРУП» называет действующую схему нарушением: скан с живыми подписями плюс электронная подпись работника. Ждут от внешней организации архив с файлами подписи, а не бумажную карту. «Металлоинвест» спецоценку тоже не снял с живой подписи: смена организации, которая её проводит, остановила договорённость подписывать усиленной неквалифицированной подписью.</w:t>
+        <w:t>Спецоценка: один вид подписи, скан, файл подписи, карта и весь отчёт. «КУПИШУЗ» упирается в то, что к карте нельзя приложить файл подписи эксперта: опции нет, это надо настраивать. В разговоре прямо звучит развилка: сотрудник подписывает одну карту, а эксперт подписывал весь отчёт. Из-за удалённости с картой знакомят копией. Скан с живой подписью компания по-прежнему считает открытым вопросом, люди, с которыми она общается, стараются запрашивать оригинал. «МЭЛОН ФЭШН ГРУП» сама говорит, что действующая схема нарушает закон об электронной подписи: карту с живыми подписями комиссии и эксперта сканируют, работник подписывает электронно. В разговоре как выход назван архив с файлами подписи от обучающей или экспертной организации; что компания уже получает такой архив, в записи нет, бумагу пока дублируют. «Металлоинвест» живую подпись по спецоценке не снял. С прежним исполнителем, от которого уходят (в расшифровке звучит как Клинский), договаривались, что комиссия и работники подпишут усиленной неквалифицированной подписью, а исполнитель подпишет у себя и передаст результат в портал. С новым исполнителем это не закрыто. «ТГК-1» карту подписывал в классическом варианте и сканировал и на замечание про один тип подписи ответил, что понимает. Проигранный спор он отнёс к другой компании, к «ТГК-1» он не отнесён. У «Балтики» отдельный узел не файл подписи, а время на обход членов комиссии.</w:t>
       </w:r>
     </w:p>
     <w:p>
@@ -3594,10 +3589,9 @@
         <w:rPr>
           <w:rFonts w:ascii="Times New Roman" w:hAnsi="Times New Roman" w:cs="Times New Roman" w:eastAsia="Times New Roman"/>
           <w:b w:val="0"/>
-          <w:i w:val="0"/>
           <w:sz w:val="24"/>
         </w:rPr>
-        <w:t>Наряд-допуск и целевой инструктаж. «Металлоинвест» регистрирует наряд под учётной записью и ролью, а целевой инструктаж на работы повышенной опасности печатает и хранит живые подписи 30 дней. Усиленная неквалифицированная подпись на этом шаге подготовлена и сознательно не включена, пока нет решения, что так можно. «ТГК-1» смотрел электронный наряд и бумагу не убрал. «Балтика» планирует электронный наряд в этом году и уже делит процесс на наряд и допуск. «КУПИШУЗ» отделяет целевой инструктаж, который подписывает охрана труда, от первичного и повторного, который заводит руководитель, и сомневается, что на наряде люди станут ещё и писать причины.</w:t>
+        <w:t>Наряд-допуск, целевой инструктаж и 30 дней хранения живых подписей. «Металлоинвест» регистрирует, открывает и закрывает наряд под учётной записью и ролью, без отдельной подписи. Целевой инструктаж на работы повышенной опасности ведут в системе и печатают на живую подпись, эти подписи хранят 30 дней, чтобы закрыть требование по наряду. Усиленная неквалифицированная подпись на этом шаге подготовлена и сознательно не включена, пока нет решения, что так можно. «ТГК-1» смотрел электронный допуск и бумагу не убрал. Обязательную форму наряда выделяет только для одного вида работ, имя правил в расшифровке не разобрать, остальные формы, по его словам, рекомендательные. «Балтика» в этом году хочет электронное оформление и уже делит процесс на наряд и допуск: наряд будет полностью в электронном согласовании, фраза про допуск обрывается. «Ареал» хочет сквозной наряд, чтобы подтянулись заявка на спецодежду, срок стажировки и наставник, сейчас это сбор в Excel. «КУПИШУЗ» отделяет целевой инструктаж, который подписывает охрана труда, от первичного и повторного, который заводит руководитель. Реплика, что на наряде придётся писать причины, в записи обрывается, отдельного вывода из неё нет.</w:t>
       </w:r>
     </w:p>
     <w:p>
@@ -3650,10 +3644,9 @@
         <w:rPr>
           <w:rFonts w:ascii="Times New Roman" w:hAnsi="Times New Roman" w:cs="Times New Roman" w:eastAsia="Times New Roman"/>
           <w:b w:val="0"/>
-          <w:i w:val="0"/>
           <w:sz w:val="24"/>
         </w:rPr>
-        <w:t>Информационная безопасность, свой удостоверяющий центр и носитель подписи. «Ареал» не отдаёт инструкции во внешние ресурсы: часть сведений может быть коммерческой. «Газпром нефть» оставляет свой удостоверяющий центр и токен, госключ называет неподходящим, личный телефон на площадке нельзя. «ТГК-1» согласовало с информационной безопасностью пароль на сменном смартфоне: физический носитель и пропуск отклонили, пароль можно передать, и это принятый компромисс. Личный телефон на объекте не используют.</w:t>
+        <w:t>Информационная безопасность, внешние ресурсы, свой удостоверяющий центр и токены. «Ареал» говорит жёстко: ничего не хранят на внешних ресурсах, часть инструкций может быть коммерческой, политика информационной безопасности не пускает документы в государственную систему. «Газпром нефть» держит свой удостоверяющий центр. В кадровом контуре квалифицированная подпись на флешке-токене: пароль на вход, на нужном шаге система спрашивает ключ. Чужой токен, по его оценке, просто так не использовать. Госключ — «нам точно не надо». Личные телефоны на площадке нельзя, местами убрали даже стационарные и оставили внутреннюю связь. «ТГК-1» согласовало с информационной безопасностью вход в приложение наряда паролем: физический носитель и пропуск отклонили, пароль можно передать, и это принятый компромисс. Личный телефон не используют, даже корпоративный смартфон внедряли с сопротивлением, объект критической инфраструктуры. «МЭЛОН ФЭШН ГРУП» на другом полюсе: положение об электронном документообороте есть, запрета личного телефона нет, линейный персонал чаще подписывает с личного, есть рабочий компьютер, можно из дома. Аналитики, кто с какого устройства подписывает, нет.</w:t>
       </w:r>
     </w:p>
     <w:p>
@@ -3664,10 +3657,9 @@
         <w:rPr>
           <w:rFonts w:ascii="Times New Roman" w:hAnsi="Times New Roman" w:cs="Times New Roman" w:eastAsia="Times New Roman"/>
           <w:b w:val="0"/>
-          <w:i w:val="0"/>
           <w:sz w:val="24"/>
         </w:rPr>
-        <w:t>Согласие работника на электронный оборот. «Ареал» связывает старт электронной подписи с согласием работника, в том числе при трудоустройстве. «Балтика» говорит, что вводный инструктаж не реализует, если вместе с разрешением придёт отдельное согласие на электронный оборот. Отдельного вопроса про согласие в анкете нет.</w:t>
+        <w:t>Согласие работника на электронный оборот. «Балтика» прямо связывает нереализуемость вводного инструктажа с согласием на электронный оборот: если оно понадобится вместе с одним внешним ресурсом, этот инструктаж у себя они не сделают. Отдельно, уже не про журнал инструктажа: без электронной подписи согласия, в том числе на обработку персональных данных и системы безопасности, человек не получит машину. У «Ареала» исследователь спросил, даёт ли работник согласие при трудоустройстве. Как компания его берёт, в расшифровке отдельным ответом не восстанавливается. Отдельного вопроса про согласие в анкете нет.</w:t>
       </w:r>
     </w:p>
     <w:p>
@@ -3692,10 +3684,9 @@
         <w:rPr>
           <w:rFonts w:ascii="Times New Roman" w:hAnsi="Times New Roman" w:cs="Times New Roman" w:eastAsia="Times New Roman"/>
           <w:b w:val="0"/>
-          <w:i w:val="0"/>
           <w:sz w:val="24"/>
         </w:rPr>
-        <w:t>Сопротивление людей. «Металлоинвест» называет подпись барьером, который пока не победили, и описывает разъяснительную кампанию: собрания, ролики, газета, видеообращения руководителей. «Балтика» оценивает оставшееся сопротивление примерно в один процент: раньше его было больше. Долю отказавшихся остальные не называют.</w:t>
+        <w:t>Сопротивление персонала и доля тех, кто не перешёл. «Балтика» оценивает оставшееся сопротивление примерно в один процент: раньше, при переходе с рукописной подписи, его было больше. Дальше человека не пускают связанные процессы, пример не из журнала инструктажа — машину не выдадут, пока согласие не подписано электронно. «Металлоинвест» называет подпись барьером, который пока не победили, и описывает разъяснительную кампанию: собрания, ролики, газета, видеообращения руководителей. Линейные руководители сначала сопротивлялись, сейчас, по его словам, благодарят, что бумаги нет. Доли отказавшихся он не назвал. «КУПИШУЗ» говорит о другом сопротивлении: те, с кем общаются лично, стараются запрашивать оригинал карты спецоценки. «МЭЛОН ФЭШН ГРУП» описывает не отказ, а нехватку навыка: не все понимают, куда нажать.</w:t>
       </w:r>
     </w:p>
     <w:p>
@@ -3710,6 +3701,71 @@
           <w:sz w:val="24"/>
         </w:rPr>
         <w:t>Вводный инструктаж для тех, кто не в контуре компании. «МЭЛОН ФЭШН ГРУП» вводный для сторонних организаций проводит только лично, не через электронный документооборот. Своим работникам вводный в системе не всегда проходит в тот же день. В анкете сторонние лица отдельно не спрашиваются.</w:t>
+      </w:r>
+    </w:p>
+    <w:p>
+      <w:pPr>
+        <w:spacing w:before="0" w:after="120" w:line="276" w:lineRule="auto"/>
+      </w:pPr>
+      <w:r>
+        <w:rPr>
+          <w:rFonts w:ascii="Times New Roman" w:hAnsi="Times New Roman" w:cs="Times New Roman" w:eastAsia="Times New Roman"/>
+          <w:b w:val="0"/>
+          <w:sz w:val="24"/>
+        </w:rPr>
+        <w:t>Связь, карьер, смена, сменный смартфон и отложенный лог. «Ареал»: перед выездом на карьер подписать негде, устойчивой связи нет, горный мастер не сидит в кабинете. Для обязательной фиксации собираются закупать устройства. Личный телефон годится, чтобы посмотреть нормы, но не как норма для обязательной подписи. Вахтовый режим как организацию электронного оборота они не описывали. «ТГК-1» выдаёт смартфон на смену, не в личное пользование. Сотрудник входит под своей учётной записью. Событие пишется логом в телефоне и уходит, когда аппарат попадает в сеть станции или возвращается в зону связи. На одном объекте Кольского филиала нормальной связи нет, на объекте может не быть и электричества. Отложенную передачу они сами считают тем, что могут не принять. «Металлоинвест»: в приграничных регионах сеть глушат, подпись с телефона сработает не везде. Единицы с кнопочными телефонами ходят в компьютерные классы. «Газпром нефть»: рабочие не сидят в сети, на удалённой площадке программа открывается очень медленно. Пример, когда на смену выдают общее устройство, он приводит как чужую практику, не как свою схему охраны труда.</w:t>
+      </w:r>
+    </w:p>
+    <w:p>
+      <w:pPr>
+        <w:spacing w:before="0" w:after="120" w:line="276" w:lineRule="auto"/>
+      </w:pPr>
+      <w:r>
+        <w:rPr>
+          <w:rFonts w:ascii="Times New Roman" w:hAnsi="Times New Roman" w:cs="Times New Roman" w:eastAsia="Times New Roman"/>
+          <w:b w:val="0"/>
+          <w:sz w:val="24"/>
+        </w:rPr>
+        <w:t>Визуальное отображение подписи. У «Ареала» на показе КЭДО подпись визуализируется на приказе, видно, кто подписал. Несколько усиленных подписей лежат отдельными файлами. Вопрос компании — как показать это внешнему получателю, если документ надо отдать наружу. Про плашку именно для инспекции они не говорили. На встрече «КУПИШУЗ» плашку PDF и показ её инспектору объясняли исследователи: придёт ГИТ, можно показать отображение, даже если отдельно смотреть файл подписи. Компания свою практику «мы так показываем инспектору» не описала. Её ответ в этом месте — нет опции приложить файл подписи, а скан живой подписи остаётся сканом.</w:t>
+      </w:r>
+    </w:p>
+    <w:p>
+      <w:pPr>
+        <w:spacing w:before="0" w:after="120" w:line="276" w:lineRule="auto"/>
+      </w:pPr>
+      <w:r>
+        <w:rPr>
+          <w:rFonts w:ascii="Times New Roman" w:hAnsi="Times New Roman" w:cs="Times New Roman" w:eastAsia="Times New Roman"/>
+          <w:b w:val="0"/>
+          <w:sz w:val="24"/>
+        </w:rPr>
+        <w:t>Позиция инспекции. Свою позицию назвала «Балтика»: бумагу держат, потому что позиция госинспекции пока не устойчивая. К проекту, который разрешал бы электронные инструктажи, они подавали комментарий — сделать как по кадровому электронному документообороту и не привязывать работодателя к одной системе. Пример суда, где компания оспорила отказ инспектора принять электронную подпись, в записях произносит исследователь. К практике компаний он не отнесён. Проигранный спор в записи «ТГК-1» рассказчик относит к другому месту работы.</w:t>
+      </w:r>
+    </w:p>
+    <w:p>
+      <w:pPr>
+        <w:spacing w:before="0" w:after="120" w:line="276" w:lineRule="auto"/>
+      </w:pPr>
+      <w:r>
+        <w:rPr>
+          <w:rFonts w:ascii="Times New Roman" w:hAnsi="Times New Roman" w:cs="Times New Roman" w:eastAsia="Times New Roman"/>
+          <w:b w:val="0"/>
+          <w:sz w:val="24"/>
+        </w:rPr>
+        <w:t>Интеграция с 1С и SAP, обучение у провайдера. «Ареал»: SAP всё ещё внедряется, местами есть 1С, TESSA согласует локальные акты без электронной подписи, КЭДО живёт отдельно. Связку «не прошёл обучение — данные сами подтянулись» они ещё собирают, в расшифровке это звучит как «привязали КС, сейчас привязываем», что такое КС, не раскрыто. «Металлоинвест»: своя система частично интегрирована с корпоративной 1С и общим документооборотом, что-то забирает и что-то отдаёт, не всё. «Балтика» с 2023 года переводит обучение в электронный документооборот вместе с провайдером. Название своей СЭД не прозвучало. У «КУПИШУЗ» личные карточки сидят в блоке 1С, проектная команда этот перевод не закрыла.</w:t>
+      </w:r>
+    </w:p>
+    <w:p>
+      <w:pPr>
+        <w:spacing w:before="0" w:after="120" w:line="276" w:lineRule="auto"/>
+      </w:pPr>
+      <w:r>
+        <w:rPr>
+          <w:rFonts w:ascii="Times New Roman" w:hAnsi="Times New Roman" w:cs="Times New Roman" w:eastAsia="Times New Roman"/>
+          <w:b w:val="0"/>
+          <w:sz w:val="24"/>
+        </w:rPr>
+        <w:t>Экономический эффект, который обещали прислать отдельно. Это «Металлоинвест». Эффект считали, чтобы обосновать свою систему: прозрачность, скорость, отказ от журналов, которые заказывали сотнями в типографии, сокращение времени на наряд-допуск, служебные письма и поручения. Цифр в записи нет. Он сказал, что отдельно этого перед ним нет, но он соберёт и отправит почтой. В конце исследователь ждёт материалы по электронному документообороту и по экономическому эффекту, канал предложили через Елену. Другие компании такой посылки не обещали. Цифры про 17 тысяч человек и около 2 млн рублей в записи «Ареала» произносит исследователь.</w:t>
       </w:r>
     </w:p>
     <w:sectPr>

</xml_diff>